<commit_message>
Adiciona sketch unico para o Wokwi web e o link do projeto
</commit_message>
<xml_diff>
--- a/docs/Roteiro_Projeto_IoT_Sistema_Seguranca.docx
+++ b/docs/Roteiro_Projeto_IoT_Sistema_Seguranca.docx
@@ -2959,15 +2959,12 @@
       <w:r>
         <w:rPr>
           <w:b/>
-          <w:highlight w:val="yellow"/>
-        </w:rPr>
-        <w:t xml:space="preserve">[PENDENTE – grupo] </w:t>
-      </w:r>
-      <w:r>
-        <w:rPr>
-          <w:highlight w:val="yellow"/>
-        </w:rPr>
-        <w:t xml:space="preserve">Link do projeto Wokwi: ______________________________________ (salvar o projeto na conta do grupo no wokwi.com e colar o link).</w:t>
+        </w:rPr>
+        <w:t xml:space="preserve">Link do projeto Wokwi: </w:t>
+      </w:r>
+      <w:r>
+        <w:rPr/>
+        <w:t xml:space="preserve">https://wokwi.com/projects/478725460238901249</w:t>
       </w:r>
     </w:p>
     <w:p xmlns:a="http://schemas.openxmlformats.org/drawingml/2006/main">
@@ -7630,15 +7627,12 @@
       <w:r>
         <w:rPr>
           <w:b/>
-          <w:highlight w:val="yellow"/>
-        </w:rPr>
-        <w:t xml:space="preserve">[PENDENTE – grupo] </w:t>
-      </w:r>
-      <w:r>
-        <w:rPr>
-          <w:highlight w:val="yellow"/>
-        </w:rPr>
-        <w:t xml:space="preserve">Preparar a apresentação (slides) e ensaiar a demonstração seguindo a tabela de testes acima.</w:t>
+        </w:rPr>
+        <w:t xml:space="preserve">Apresentação: </w:t>
+      </w:r>
+      <w:r>
+        <w:rPr/>
+        <w:t xml:space="preserve">slides no Canva (14 slides, do problema à conclusão) e demonstração com o vídeo docs/video/sistema-seguranca-iot-demo.mp4 ou ao vivo no Wokwi, seguindo a tabela de testes acima.</w:t>
       </w:r>
     </w:p>
     <w:p>

</xml_diff>